<commit_message>
no apto, segunda entrega
</commit_message>
<xml_diff>
--- a/docs/Entregas/Elección de Tema (Obligatorio).docx
+++ b/docs/Entregas/Elección de Tema (Obligatorio).docx
@@ -331,28 +331,31 @@
         <w:t xml:space="preserve">aplicación Android en la que </w:t>
       </w:r>
       <w:r>
+        <w:t xml:space="preserve"> las enfermeras </w:t>
+      </w:r>
+      <w:r>
+        <w:t xml:space="preserve">puedan iniciar sesión </w:t>
+      </w:r>
+    </w:p>
+    <w:p>
+      <w:pPr>
+        <w:numPr>
+          <w:ilvl w:val="1"/>
+          <w:numId w:val="2"/>
+        </w:numPr>
+      </w:pPr>
+      <w:r>
+        <w:rPr>
+          <w:b/>
+          <w:bCs/>
+        </w:rPr>
+        <w:t>Opcional si dispongo de tiempo:</w:t>
+      </w:r>
+      <w:r>
         <w:t xml:space="preserve"> </w:t>
       </w:r>
       <w:r>
-        <w:t xml:space="preserve">las enfermeras </w:t>
-      </w:r>
-      <w:r>
-        <w:t xml:space="preserve">puedan iniciar sesión y leer un código </w:t>
-      </w:r>
-      <w:r>
-        <w:t>QR</w:t>
-      </w:r>
-      <w:r>
-        <w:t xml:space="preserve"> </w:t>
-      </w:r>
-      <w:r>
-        <w:t>donde obtengan l</w:t>
-      </w:r>
-      <w:r>
-        <w:t>a ficha del paciente con su información y visita del día</w:t>
-      </w:r>
-      <w:r>
-        <w:t xml:space="preserve">. </w:t>
+        <w:t>leer un código QR donde obtengan la ficha del paciente con su información y visita del día.</w:t>
       </w:r>
     </w:p>
     <w:p>
@@ -379,6 +382,48 @@
     <w:p>
       <w:pPr>
         <w:numPr>
+          <w:ilvl w:val="1"/>
+          <w:numId w:val="2"/>
+        </w:numPr>
+      </w:pPr>
+      <w:r>
+        <w:rPr>
+          <w:b/>
+          <w:bCs/>
+        </w:rPr>
+        <w:t>Opcional</w:t>
+      </w:r>
+      <w:r>
+        <w:rPr>
+          <w:b/>
+          <w:bCs/>
+        </w:rPr>
+        <w:t xml:space="preserve"> </w:t>
+      </w:r>
+      <w:r>
+        <w:rPr>
+          <w:b/>
+          <w:bCs/>
+        </w:rPr>
+        <w:t>si dispongo de tiempo</w:t>
+      </w:r>
+      <w:r>
+        <w:rPr>
+          <w:b/>
+          <w:bCs/>
+        </w:rPr>
+        <w:t>:</w:t>
+      </w:r>
+      <w:r>
+        <w:t xml:space="preserve"> gestión administrativa</w:t>
+      </w:r>
+      <w:r>
+        <w:t>, horarios laborables</w:t>
+      </w:r>
+    </w:p>
+    <w:p>
+      <w:pPr>
+        <w:numPr>
           <w:ilvl w:val="0"/>
           <w:numId w:val="2"/>
         </w:numPr>
@@ -409,7 +454,7 @@
         <w:t>Seguridad y Base de Datos:</w:t>
       </w:r>
       <w:r>
-        <w:t xml:space="preserve"> Diseñar una base de datos relacional MySQL normalizada y aplicar algoritmos hash y cifrado al 100% de las contraseñas y datos sensibles de los usuarios</w:t>
+        <w:t xml:space="preserve"> Diseñar una base de datos relacional MySQL normalizada</w:t>
       </w:r>
       <w:r>
         <w:t>.</w:t>
@@ -417,6 +462,41 @@
     </w:p>
     <w:p>
       <w:pPr>
+        <w:numPr>
+          <w:ilvl w:val="1"/>
+          <w:numId w:val="2"/>
+        </w:numPr>
+      </w:pPr>
+      <w:r>
+        <w:rPr>
+          <w:b/>
+          <w:bCs/>
+        </w:rPr>
+        <w:t xml:space="preserve">Opcional </w:t>
+      </w:r>
+      <w:r>
+        <w:rPr>
+          <w:b/>
+          <w:bCs/>
+        </w:rPr>
+        <w:t>si dispongo de tiempo</w:t>
+      </w:r>
+      <w:r>
+        <w:rPr>
+          <w:b/>
+          <w:bCs/>
+        </w:rPr>
+        <w:t>:</w:t>
+      </w:r>
+      <w:r>
+        <w:t xml:space="preserve"> </w:t>
+      </w:r>
+      <w:r>
+        <w:t>aplicar algoritmos hash y cifrado al 100% de las contraseñas y datos sensibles de los usuarios.</w:t>
+      </w:r>
+    </w:p>
+    <w:p>
+      <w:pPr>
         <w:rPr>
           <w:b/>
           <w:bCs/>
@@ -514,7 +594,25 @@
       </w:pPr>
     </w:p>
     <w:p>
-      <w:r>
+      <w:pPr>
+        <w:rPr>
+          <w:b/>
+          <w:bCs/>
+        </w:rPr>
+      </w:pPr>
+    </w:p>
+    <w:p>
+      <w:pPr>
+        <w:rPr>
+          <w:b/>
+          <w:bCs/>
+        </w:rPr>
+      </w:pPr>
+    </w:p>
+    <w:p/>
+    <w:p>
+      <w:r>
+        <w:lastRenderedPageBreak/>
         <w:t>Entorno de Desarrollo y Hardware:</w:t>
       </w:r>
     </w:p>
@@ -559,7 +657,6 @@
     <w:p/>
     <w:p>
       <w:r>
-        <w:lastRenderedPageBreak/>
         <w:t>Aplicación de Escritorio:</w:t>
       </w:r>
     </w:p>
@@ -669,7 +766,19 @@
         </w:numPr>
       </w:pPr>
       <w:r>
-        <w:t>Lenguaje: Kotlin.</w:t>
+        <w:t>Lenguaje: Kotlin</w:t>
+      </w:r>
+      <w:r>
+        <w:t xml:space="preserve"> </w:t>
+      </w:r>
+      <w:r>
+        <w:t>(con librerías</w:t>
+      </w:r>
+      <w:r>
+        <w:t xml:space="preserve"> si son necesarias y justificadas)</w:t>
+      </w:r>
+      <w:r>
+        <w:t>.</w:t>
       </w:r>
     </w:p>
     <w:p>
@@ -729,8 +838,10 @@
         <w:t xml:space="preserve"> Es la herramienta nativa por excelencia. Proporciona el mejor soporte para el diseño visual de interfaces (XML), depuración de código en tiempo real y emulación de dispositivos móviles.</w:t>
       </w:r>
     </w:p>
-    <w:p>
-      <w:r>
+    <w:p/>
+    <w:p>
+      <w:r>
+        <w:lastRenderedPageBreak/>
         <w:t>Base de Datos:</w:t>
       </w:r>
     </w:p>
@@ -763,11 +874,102 @@
         <w:t xml:space="preserve"> MySQL es un Sistema de Gestión de Bases de Datos Relacionales (SGBDR) maduro, seguro y de código abierto. Su excelente integración con Java e Hibernate lo hace ideal para mantener la integridad referencial y centralizar los datos de la clínica.</w:t>
       </w:r>
     </w:p>
+    <w:p>
+      <w:pPr>
+        <w:numPr>
+          <w:ilvl w:val="0"/>
+          <w:numId w:val="6"/>
+        </w:numPr>
+      </w:pPr>
+      <w:r>
+        <w:rPr>
+          <w:i/>
+          <w:iCs/>
+        </w:rPr>
+        <w:t>Tablas:</w:t>
+      </w:r>
+    </w:p>
+    <w:p>
+      <w:pPr>
+        <w:numPr>
+          <w:ilvl w:val="1"/>
+          <w:numId w:val="6"/>
+        </w:numPr>
+      </w:pPr>
+      <w:r>
+        <w:t>Especialidad</w:t>
+      </w:r>
+    </w:p>
+    <w:p>
+      <w:pPr>
+        <w:numPr>
+          <w:ilvl w:val="1"/>
+          <w:numId w:val="6"/>
+        </w:numPr>
+      </w:pPr>
+      <w:r>
+        <w:t>Trabajador</w:t>
+      </w:r>
+    </w:p>
+    <w:p>
+      <w:pPr>
+        <w:numPr>
+          <w:ilvl w:val="1"/>
+          <w:numId w:val="6"/>
+        </w:numPr>
+      </w:pPr>
+      <w:r>
+        <w:t>Cita</w:t>
+      </w:r>
+    </w:p>
+    <w:p>
+      <w:pPr>
+        <w:numPr>
+          <w:ilvl w:val="1"/>
+          <w:numId w:val="6"/>
+        </w:numPr>
+      </w:pPr>
+      <w:r>
+        <w:t>Historial_medico</w:t>
+      </w:r>
+    </w:p>
+    <w:p>
+      <w:pPr>
+        <w:numPr>
+          <w:ilvl w:val="1"/>
+          <w:numId w:val="6"/>
+        </w:numPr>
+      </w:pPr>
+      <w:r>
+        <w:t>Paiente</w:t>
+      </w:r>
+    </w:p>
+    <w:p>
+      <w:pPr>
+        <w:numPr>
+          <w:ilvl w:val="1"/>
+          <w:numId w:val="6"/>
+        </w:numPr>
+      </w:pPr>
+      <w:r>
+        <w:t>Opcionales</w:t>
+      </w:r>
+    </w:p>
+    <w:p>
+      <w:pPr>
+        <w:numPr>
+          <w:ilvl w:val="2"/>
+          <w:numId w:val="6"/>
+        </w:numPr>
+      </w:pPr>
+      <w:r>
+        <w:t>Horario laboral</w:t>
+      </w:r>
+    </w:p>
     <w:p/>
     <w:p/>
     <w:p>
       <w:r>
-        <w:lastRenderedPageBreak/>
         <w:t>Comunicación, Concurrencia y Seguridad:</w:t>
       </w:r>
     </w:p>
@@ -801,21 +1003,26 @@
       </w:r>
     </w:p>
     <w:p>
+      <w:r>
+        <w:t>Control de Calidad y Versiones:</w:t>
+      </w:r>
+    </w:p>
+    <w:p>
       <w:pPr>
         <w:numPr>
           <w:ilvl w:val="0"/>
-          <w:numId w:val="7"/>
-        </w:numPr>
-      </w:pPr>
-      <w:r>
-        <w:t>Seguridad: Librerías criptográficas de Java (Algoritmos Hash).</w:t>
+          <w:numId w:val="8"/>
+        </w:numPr>
+      </w:pPr>
+      <w:r>
+        <w:t>Herramientas: Git y GitHub.</w:t>
       </w:r>
     </w:p>
     <w:p>
       <w:pPr>
         <w:numPr>
           <w:ilvl w:val="1"/>
-          <w:numId w:val="7"/>
+          <w:numId w:val="8"/>
         </w:numPr>
       </w:pPr>
       <w:r>
@@ -826,40 +1033,6 @@
         <w:t>Justificación:</w:t>
       </w:r>
       <w:r>
-        <w:t xml:space="preserve"> Al tratarse de un entorno clínico, es obligatorio proteger la información. El uso de algoritmos hash garantiza que las contraseñas no se almacenen en texto plano, aportando una capa indispensable de ciberseguridad.</w:t>
-      </w:r>
-    </w:p>
-    <w:p>
-      <w:r>
-        <w:t>Control de Calidad y Versiones:</w:t>
-      </w:r>
-    </w:p>
-    <w:p>
-      <w:pPr>
-        <w:numPr>
-          <w:ilvl w:val="0"/>
-          <w:numId w:val="8"/>
-        </w:numPr>
-      </w:pPr>
-      <w:r>
-        <w:t>Herramientas: Git y GitHub.</w:t>
-      </w:r>
-    </w:p>
-    <w:p>
-      <w:pPr>
-        <w:numPr>
-          <w:ilvl w:val="1"/>
-          <w:numId w:val="8"/>
-        </w:numPr>
-      </w:pPr>
-      <w:r>
-        <w:rPr>
-          <w:i/>
-          <w:iCs/>
-        </w:rPr>
-        <w:t>Justificación:</w:t>
-      </w:r>
-      <w:r>
         <w:t xml:space="preserve"> Permite llevar un control absoluto sobre el histórico de cambios del código fuente, facilita la creación de ramas independientes (por ejemplo, separar el desarrollo de Android del de escritorio) y asegura un respaldo constante en la nube.</w:t>
       </w:r>
     </w:p>
@@ -892,6 +1065,7 @@
           <w:b/>
           <w:bCs/>
         </w:rPr>
+        <w:lastRenderedPageBreak/>
         <w:br w:type="page"/>
       </w:r>
     </w:p>
@@ -908,12 +1082,14 @@
         <w:rPr>
           <w:b/>
           <w:bCs/>
-        </w:rPr>
-      </w:pPr>
-      <w:r>
-        <w:rPr>
-          <w:b/>
-          <w:bCs/>
+          <w:highlight w:val="green"/>
+        </w:rPr>
+      </w:pPr>
+      <w:r>
+        <w:rPr>
+          <w:b/>
+          <w:bCs/>
+          <w:highlight w:val="green"/>
         </w:rPr>
         <w:t>Pregunta 3</w:t>
       </w:r>
@@ -923,12 +1099,14 @@
         <w:rPr>
           <w:b/>
           <w:bCs/>
-        </w:rPr>
-      </w:pPr>
-      <w:r>
-        <w:rPr>
-          <w:b/>
-          <w:bCs/>
+          <w:highlight w:val="green"/>
+        </w:rPr>
+      </w:pPr>
+      <w:r>
+        <w:rPr>
+          <w:b/>
+          <w:bCs/>
+          <w:highlight w:val="green"/>
         </w:rPr>
         <w:t xml:space="preserve">1 punto </w:t>
       </w:r>
@@ -938,12 +1116,14 @@
         <w:rPr>
           <w:b/>
           <w:bCs/>
-        </w:rPr>
-      </w:pPr>
-      <w:r>
-        <w:rPr>
-          <w:b/>
-          <w:bCs/>
+          <w:highlight w:val="green"/>
+        </w:rPr>
+      </w:pPr>
+      <w:r>
+        <w:rPr>
+          <w:b/>
+          <w:bCs/>
+          <w:highlight w:val="green"/>
         </w:rPr>
         <w:t>Aplicación de las asignaturas al proyecto</w:t>
       </w:r>
@@ -953,12 +1133,14 @@
         <w:rPr>
           <w:b/>
           <w:bCs/>
-        </w:rPr>
-      </w:pPr>
-      <w:r>
-        <w:rPr>
-          <w:b/>
-          <w:bCs/>
+          <w:highlight w:val="green"/>
+        </w:rPr>
+      </w:pPr>
+      <w:r>
+        <w:rPr>
+          <w:b/>
+          <w:bCs/>
+          <w:highlight w:val="green"/>
         </w:rPr>
         <w:t>Es esencial que los estudiantes muestren una comprensión profunda de la teoría y demuestren una capacidad práctica para integrarla en el desarrollo de su proyecto final. Explica qué conocimientos de varias asignaturas del ciclo vas a aplicar realmente en tu proyecto. No se trata de resumir las asignaturas, sino de indicar qué vas a utilizar y cómo lo aplicarás en la aplicación. Incluye varias asignaturas relevantes para tu proyecto y redacta una breve explicación para cada una.</w:t>
       </w:r>
@@ -968,12 +1150,14 @@
         <w:rPr>
           <w:b/>
           <w:bCs/>
-        </w:rPr>
-      </w:pPr>
-      <w:r>
-        <w:rPr>
-          <w:b/>
-          <w:bCs/>
+          <w:highlight w:val="green"/>
+        </w:rPr>
+      </w:pPr>
+      <w:r>
+        <w:rPr>
+          <w:b/>
+          <w:bCs/>
+          <w:highlight w:val="green"/>
         </w:rPr>
         <w:t>Ejemplo: Bases de Datos: aplicaré el modelo relacional y SQL para almacenar la información de 3 tablas, clientes, reservas y servicios mediante tablas relacionadas.</w:t>
       </w:r>
@@ -985,12 +1169,24 @@
           <w:ilvl w:val="0"/>
           <w:numId w:val="9"/>
         </w:numPr>
-      </w:pPr>
-      <w:r>
+        <w:rPr>
+          <w:highlight w:val="green"/>
+        </w:rPr>
+      </w:pPr>
+      <w:r>
+        <w:rPr>
+          <w:highlight w:val="green"/>
+        </w:rPr>
         <w:t>Acceso a datos: Utilizaré Hibernate (ORM) para mapear las clases de Java a la base de datos central, automatizando la persistencia y permitiendo el intercambio seguro de los expedientes de pacientes y agendas médicas.</w:t>
       </w:r>
     </w:p>
-    <w:p/>
+    <w:p>
+      <w:pPr>
+        <w:rPr>
+          <w:highlight w:val="green"/>
+        </w:rPr>
+      </w:pPr>
+    </w:p>
     <w:p>
       <w:pPr>
         <w:pStyle w:val="Prrafodelista"/>
@@ -998,12 +1194,24 @@
           <w:ilvl w:val="0"/>
           <w:numId w:val="9"/>
         </w:numPr>
-      </w:pPr>
-      <w:r>
+        <w:rPr>
+          <w:highlight w:val="green"/>
+        </w:rPr>
+      </w:pPr>
+      <w:r>
+        <w:rPr>
+          <w:highlight w:val="green"/>
+        </w:rPr>
         <w:t>Desarrollo de interfaces: Aplicaré Swing y librerías de terceros para crear las vistas gráficas de la aplicación de escritorio, diseñando pantallas interactivas para que el personal de recepción gestione el CRUD de pacientes, facultativos y el calendario.</w:t>
       </w:r>
     </w:p>
-    <w:p/>
+    <w:p>
+      <w:pPr>
+        <w:rPr>
+          <w:highlight w:val="green"/>
+        </w:rPr>
+      </w:pPr>
+    </w:p>
     <w:p>
       <w:pPr>
         <w:pStyle w:val="Prrafodelista"/>
@@ -1011,12 +1219,24 @@
           <w:ilvl w:val="0"/>
           <w:numId w:val="9"/>
         </w:numPr>
-      </w:pPr>
-      <w:r>
+        <w:rPr>
+          <w:highlight w:val="green"/>
+        </w:rPr>
+      </w:pPr>
+      <w:r>
+        <w:rPr>
+          <w:highlight w:val="green"/>
+        </w:rPr>
         <w:t>Base de datos: Diseñaré un modelo relacional normalizado en MySQL, gestionando el control de integridad referencial y escribiendo consultas SQL para almacenar y relacionar entidades clave como pacientes, especialistas, salas y consultas.</w:t>
       </w:r>
     </w:p>
-    <w:p/>
+    <w:p>
+      <w:pPr>
+        <w:rPr>
+          <w:highlight w:val="green"/>
+        </w:rPr>
+      </w:pPr>
+    </w:p>
     <w:p>
       <w:pPr>
         <w:pStyle w:val="Prrafodelista"/>
@@ -1024,12 +1244,24 @@
           <w:ilvl w:val="0"/>
           <w:numId w:val="9"/>
         </w:numPr>
-      </w:pPr>
-      <w:r>
+        <w:rPr>
+          <w:highlight w:val="green"/>
+        </w:rPr>
+      </w:pPr>
+      <w:r>
+        <w:rPr>
+          <w:highlight w:val="green"/>
+        </w:rPr>
         <w:t>Programación: Aplicaré los principios de la Programación Orientada a Objetos (POO) en Java y Kotlin, diseñando clases, herencias y algoritmos que estructuren la lógica de negocio subyacente en todas las aplicaciones del ecosistema MedManager.</w:t>
       </w:r>
     </w:p>
-    <w:p/>
+    <w:p>
+      <w:pPr>
+        <w:rPr>
+          <w:highlight w:val="green"/>
+        </w:rPr>
+      </w:pPr>
+    </w:p>
     <w:p>
       <w:pPr>
         <w:pStyle w:val="Prrafodelista"/>
@@ -1037,12 +1269,24 @@
           <w:ilvl w:val="0"/>
           <w:numId w:val="9"/>
         </w:numPr>
-      </w:pPr>
-      <w:r>
+        <w:rPr>
+          <w:highlight w:val="green"/>
+        </w:rPr>
+      </w:pPr>
+      <w:r>
+        <w:rPr>
+          <w:highlight w:val="green"/>
+        </w:rPr>
         <w:t>Sistemas informáticos: Definiré la arquitectura de red cliente-servidor y configuraré el entorno operativo para alojar de forma estable el servidor propio y la base de datos centralizada.</w:t>
       </w:r>
     </w:p>
-    <w:p/>
+    <w:p>
+      <w:pPr>
+        <w:rPr>
+          <w:highlight w:val="green"/>
+        </w:rPr>
+      </w:pPr>
+    </w:p>
     <w:p>
       <w:pPr>
         <w:pStyle w:val="Prrafodelista"/>
@@ -1050,12 +1294,24 @@
           <w:ilvl w:val="0"/>
           <w:numId w:val="9"/>
         </w:numPr>
-      </w:pPr>
-      <w:r>
+        <w:rPr>
+          <w:highlight w:val="green"/>
+        </w:rPr>
+      </w:pPr>
+      <w:r>
+        <w:rPr>
+          <w:highlight w:val="green"/>
+        </w:rPr>
         <w:t>Entornos de desarrollo: Manejaré IDEs profesionales (Eclipse para escritorio/servidor y Android Studio para móvil) y aplicaré flujos de trabajo de control de versiones con repositorios Git/GitHub para aislar el desarrollo de cada plataforma.</w:t>
       </w:r>
     </w:p>
-    <w:p/>
+    <w:p>
+      <w:pPr>
+        <w:rPr>
+          <w:highlight w:val="green"/>
+        </w:rPr>
+      </w:pPr>
+    </w:p>
     <w:p>
       <w:pPr>
         <w:pStyle w:val="Prrafodelista"/>
@@ -1063,12 +1319,24 @@
           <w:ilvl w:val="0"/>
           <w:numId w:val="9"/>
         </w:numPr>
-      </w:pPr>
-      <w:r>
+        <w:rPr>
+          <w:highlight w:val="green"/>
+        </w:rPr>
+      </w:pPr>
+      <w:r>
+        <w:rPr>
+          <w:highlight w:val="green"/>
+        </w:rPr>
         <w:t>Lenguaje de marcas y sistemas de gestión: Utilizaré XML para estructurar jerárquicamente el diseño visual y los layouts de las pantallas nativas en la aplicación de Android Studio.</w:t>
       </w:r>
     </w:p>
-    <w:p/>
+    <w:p>
+      <w:pPr>
+        <w:rPr>
+          <w:highlight w:val="green"/>
+        </w:rPr>
+      </w:pPr>
+    </w:p>
     <w:p>
       <w:pPr>
         <w:pStyle w:val="Prrafodelista"/>
@@ -1076,12 +1344,24 @@
           <w:ilvl w:val="0"/>
           <w:numId w:val="9"/>
         </w:numPr>
-      </w:pPr>
-      <w:r>
+        <w:rPr>
+          <w:highlight w:val="green"/>
+        </w:rPr>
+      </w:pPr>
+      <w:r>
+        <w:rPr>
+          <w:highlight w:val="green"/>
+        </w:rPr>
         <w:t>Programación de servicios y procesos: Implementaré una arquitectura mediante Sockets TCP/IP en Java, utilizando programación multihilo para procesar peticiones concurrentes de distintos usuarios (médicos y administrativos), y aplicaré algoritmos hash para encriptar las contraseñas en las autenticaciones.</w:t>
       </w:r>
     </w:p>
-    <w:p/>
+    <w:p>
+      <w:pPr>
+        <w:rPr>
+          <w:highlight w:val="green"/>
+        </w:rPr>
+      </w:pPr>
+    </w:p>
     <w:p>
       <w:pPr>
         <w:pStyle w:val="Prrafodelista"/>
@@ -1089,33 +1369,65 @@
           <w:ilvl w:val="0"/>
           <w:numId w:val="9"/>
         </w:numPr>
-      </w:pPr>
-      <w:r>
+        <w:rPr>
+          <w:highlight w:val="green"/>
+        </w:rPr>
+      </w:pPr>
+      <w:r>
+        <w:rPr>
+          <w:highlight w:val="green"/>
+        </w:rPr>
         <w:t>Programación multimedia y dispositivos móviles: Desarrollaré la aplicación nativa en Kotlin e integraré los permisos y el acceso al hardware del terminal (cámara) para programar el módulo de escaneo e identificación de pacientes mediante códigos QR.</w:t>
       </w:r>
     </w:p>
-    <w:p/>
-    <w:p/>
+    <w:p>
+      <w:pPr>
+        <w:rPr>
+          <w:highlight w:val="green"/>
+        </w:rPr>
+      </w:pPr>
+    </w:p>
+    <w:p>
+      <w:pPr>
+        <w:rPr>
+          <w:highlight w:val="green"/>
+        </w:rPr>
+      </w:pPr>
+    </w:p>
     <w:p>
       <w:pPr>
         <w:suppressAutoHyphens w:val="0"/>
-      </w:pPr>
-      <w:r>
+        <w:rPr>
+          <w:highlight w:val="green"/>
+        </w:rPr>
+      </w:pPr>
+      <w:r>
+        <w:rPr>
+          <w:highlight w:val="green"/>
+        </w:rPr>
         <w:br w:type="page"/>
       </w:r>
     </w:p>
-    <w:p/>
-    <w:p>
-      <w:pPr>
-        <w:rPr>
-          <w:b/>
-          <w:bCs/>
-        </w:rPr>
-      </w:pPr>
-      <w:r>
-        <w:rPr>
-          <w:b/>
-          <w:bCs/>
+    <w:p>
+      <w:pPr>
+        <w:rPr>
+          <w:highlight w:val="green"/>
+        </w:rPr>
+      </w:pPr>
+    </w:p>
+    <w:p>
+      <w:pPr>
+        <w:rPr>
+          <w:b/>
+          <w:bCs/>
+          <w:highlight w:val="green"/>
+        </w:rPr>
+      </w:pPr>
+      <w:r>
+        <w:rPr>
+          <w:b/>
+          <w:bCs/>
+          <w:highlight w:val="green"/>
         </w:rPr>
         <w:t>Pregunta 4</w:t>
       </w:r>
@@ -1125,12 +1437,14 @@
         <w:rPr>
           <w:b/>
           <w:bCs/>
-        </w:rPr>
-      </w:pPr>
-      <w:r>
-        <w:rPr>
-          <w:b/>
-          <w:bCs/>
+          <w:highlight w:val="green"/>
+        </w:rPr>
+      </w:pPr>
+      <w:r>
+        <w:rPr>
+          <w:b/>
+          <w:bCs/>
+          <w:highlight w:val="green"/>
         </w:rPr>
         <w:t>1</w:t>
       </w:r>
@@ -1140,12 +1454,14 @@
         <w:rPr>
           <w:b/>
           <w:bCs/>
-        </w:rPr>
-      </w:pPr>
-      <w:r>
-        <w:rPr>
-          <w:b/>
-          <w:bCs/>
+          <w:highlight w:val="green"/>
+        </w:rPr>
+      </w:pPr>
+      <w:r>
+        <w:rPr>
+          <w:b/>
+          <w:bCs/>
+          <w:highlight w:val="green"/>
         </w:rPr>
         <w:t xml:space="preserve"> punto </w:t>
       </w:r>
@@ -1155,12 +1471,14 @@
         <w:rPr>
           <w:b/>
           <w:bCs/>
-        </w:rPr>
-      </w:pPr>
-      <w:r>
-        <w:rPr>
-          <w:b/>
-          <w:bCs/>
+          <w:highlight w:val="green"/>
+        </w:rPr>
+      </w:pPr>
+      <w:r>
+        <w:rPr>
+          <w:b/>
+          <w:bCs/>
+          <w:highlight w:val="green"/>
         </w:rPr>
         <w:t>Justificación de la elección de la temática</w:t>
       </w:r>
@@ -1170,12 +1488,14 @@
         <w:rPr>
           <w:b/>
           <w:bCs/>
-        </w:rPr>
-      </w:pPr>
-      <w:r>
-        <w:rPr>
-          <w:b/>
-          <w:bCs/>
+          <w:highlight w:val="green"/>
+        </w:rPr>
+      </w:pPr>
+      <w:r>
+        <w:rPr>
+          <w:b/>
+          <w:bCs/>
+          <w:highlight w:val="green"/>
         </w:rPr>
         <w:t>Explica por qué el tema es importante para ti, tanto si es por temas personales o profesionales. ¿Tienes una conexión personal, experiencia profesional o un interés especial en este tema? ¿Qué te inspiró a elegirlo? Explica también cómo el tema se alinea con tus objetivos de aprendizaje y los objetivos del ciclo.</w:t>
       </w:r>
@@ -1185,17 +1505,35 @@
         <w:rPr>
           <w:b/>
           <w:bCs/>
-        </w:rPr>
-      </w:pPr>
-    </w:p>
-    <w:p>
-      <w:r>
+          <w:highlight w:val="green"/>
+        </w:rPr>
+      </w:pPr>
+    </w:p>
+    <w:p>
+      <w:pPr>
+        <w:rPr>
+          <w:highlight w:val="green"/>
+        </w:rPr>
+      </w:pPr>
+      <w:r>
+        <w:rPr>
+          <w:highlight w:val="green"/>
+        </w:rPr>
         <w:t>La elección de esta temática nace de mi gran interés profesional por enfrentarme al reto de diseñar un ecosistema de software completo desde cero, capaz de dar respuesta a un entorno de alta exigencia. En el sector sanitario actual, la digitalización eficiente, la centralización de la información y la comunicación ágil entre pacientes, médicos y personal administrativo son factores clave para ofrecer una atención de calidad. Este proyecto aborda esta necesidad desarrollando un ecosistema informático multiplataforma completo, diseñado para modernizar los flujos de trabajo clínicos y agilizar una gestión fácil y eficaz. A través de esta solución, se elimina el uso del papel, se agiliza de forma significativa la gestión de citas y expedientes clínicos, y se facilitan interfaces específicas adaptadas a cada rol de usuario, garantizando en todo momento la sincronización de la información en tiempo real.</w:t>
       </w:r>
     </w:p>
-    <w:p/>
-    <w:p>
-      <w:r>
+    <w:p>
+      <w:pPr>
+        <w:rPr>
+          <w:highlight w:val="green"/>
+        </w:rPr>
+      </w:pPr>
+    </w:p>
+    <w:p>
+      <w:r>
+        <w:rPr>
+          <w:highlight w:val="green"/>
+        </w:rPr>
         <w:t>A nivel personal y académico, este proyecto me resulta especialmente inspirador porque representa un desafío técnico integral que se alinea a la perfección con los objetivos del ciclo de Desarrollo de Aplicaciones Multiplataforma (DAM). Me permite poner en práctica y conectar todo lo aprendido, integrando el desarrollo de aplicaciones de escritorio orientadas a la administración, el despliegue de aplicaciones móviles nativas para el personal, y la construcción de un backend robusto y seguro. Con MedManager, cumplo mi objetivo principal de aprendizaje: demostrar mi capacidad como desarrollador para estructurar, programar y comunicar múltiples plataformas dentro de un mismo sistema unificado y escalable.</w:t>
       </w:r>
     </w:p>

</xml_diff>